<commit_message>
Slide 9: análisis ampliado del descarte por edición en el guion P3
Co-Authored-By: Claude Opus 4.8 <noreply@anthropic.com>
</commit_message>
<xml_diff>
--- a/presentacion/speech_parte3.docx
+++ b/presentacion/speech_parte3.docx
@@ -29,7 +29,7 @@
           <w:color w:val="555555"/>
           <w:sz w:val="18"/>
         </w:rPr>
-        <w:t>Slides 8 a 12  ·  ~3:30 min  ·  lo que está en cursiva y entre corchetes no se lee</w:t>
+        <w:t>Slides 8 a 12  ·  ~3:50 min  ·  lo que está en cursiva y entre corchetes no se lee</w:t>
       </w:r>
     </w:p>
     <w:p>
@@ -109,7 +109,7 @@
           <w:color w:val="B88600"/>
           <w:sz w:val="23"/>
         </w:rPr>
-        <w:t>SLIDE 9 — LA LIMPIEZA EN NÚMEROS (~0:20)</w:t>
+        <w:t>SLIDE 9 — LA LIMPIEZA EN NÚMEROS (~0:40)</w:t>
       </w:r>
     </w:p>
     <w:p>
@@ -122,7 +122,20 @@
           <w:i w:val="0"/>
           <w:sz w:val="22"/>
         </w:rPr>
-        <w:t>[pasar de slide]  Y esto no es un relato: se mide. Edición por edición, en gris lo que llegó y en negro lo que quedó. La brecha es mínima: de 32.309 filas conservamos 31.088, descartamos apenas el 3,8%. Limpiar no es recortar: es conservar datos confiables.</w:t>
+        <w:t>[pasar de slide]  Y esto no es un relato: se mide. Edición por edición, en gris lo que llegó y en negro lo que quedó. De 32.309 filas conservamos 31.088 —descartamos apenas el 3,8%—. Pero miren un detalle interesante: el descarte no es parejo. Las ediciones viejas, 2022 y 2023, pierden entre un 5 y un 8% —venían con formularios más libres, más campos incompletos, más errores de carga—. En las recientes, el descarte es casi cero: en 2024.1 descartamos literalmente dos filas de cinco mil cuatrocientas.</w:t>
+      </w:r>
+    </w:p>
+    <w:p>
+      <w:pPr>
+        <w:spacing w:after="140"/>
+      </w:pPr>
+      <w:r>
+        <w:rPr>
+          <w:b w:val="0"/>
+          <w:i w:val="0"/>
+          <w:sz w:val="22"/>
+        </w:rPr>
+        <w:t>Y hay algo más importante que el total: ninguna edición quedó vaciada. Eso garantiza que la limpieza no metió sesgo temporal —clave, porque como van a ver después, el modelo se valida entrenando con las ediciones viejas y testeando con la última—. En resumen: limpiar no es recortar; es conservar datos confiables, y de manera pareja en el tiempo.</w:t>
       </w:r>
     </w:p>
     <w:p>

</xml_diff>